<commit_message>
Tests de bout en bout de la 4a : T5 (SECURVIE, 3 bénéficiaires, DECES à 0 %) et T6 (VOL, document seul, montants de fixture)
Co-Authored-By: Claude Sonnet 5.5 <noreply@anthropic.com>
Claude-Session: https://claude.ai/code/session_017VfNYkH9N9C9cL5A6mohic
</commit_message>
<xml_diff>
--- a/generateur/tests/fixtures/t9_balise_inconnue.docx
+++ b/generateur/tests/fixtures/t9_balise_inconnue.docx
@@ -4,7 +4,32 @@
   <w:body>
     <w:p>
       <w:r>
-        <w:t>CONDITIONS PARTICULIÈRES – police n° {{ police.numero }}</w:t>
+        <w:t>CONDITIONS PARTICULIÈRES – {{ produit.libelle }} – police n° {{ police.numero }}</w:t>
+      </w:r>
+    </w:p>
+    <w:p>
+      <w:r>
+        <w:t>Souscripteur : {% if souscripteur.type == 'MORALE' %}{{ souscripteur.raison_sociale }}{% else %}{{ souscripteur.nom }} {{ souscripteur.prenoms }}{% endif %}</w:t>
+      </w:r>
+    </w:p>
+    <w:p>
+      <w:r>
+        <w:t>Effet : {{ police.date_effet | date }} ; échéance : {{ police.date_echeance | date }} ; durée : {{ police.duree_libelle }}</w:t>
+      </w:r>
+    </w:p>
+    <w:p>
+      <w:r>
+        <w:t>{%p for i in intermediaires %}</w:t>
+      </w:r>
+    </w:p>
+    <w:p>
+      <w:r>
+        <w:t>Intermédiaire : {{ i.nom }} ({{ i.code }})</w:t>
+      </w:r>
+    </w:p>
+    <w:p>
+      <w:r>
+        <w:t>{%p endfor %}</w:t>
       </w:r>
     </w:p>
     <w:tbl>
@@ -64,7 +89,32 @@
     </w:tbl>
     <w:p>
       <w:r>
-        <w:t>Souscripteur : {{ souscripteur.nom }} ; du {{ police.date_effet | date }} au {{ police.date_echeance | date }} ; prime TTC {{ prime.ttc | montant }}</w:t>
+        <w:t>Primes : nette {{ prime.nette | montant }} ; accessoires {{ prime.accessoires | montant }} ; taxe ({{ prime.taux_taxe | pct }}) {{ prime.taxe | montant }} ; TOTAL TTC {{ prime.ttc | montant }} F CFA, soit {{ prime.ttc | lettres }}.</w:t>
+      </w:r>
+    </w:p>
+    <w:p>
+      <w:r>
+        <w:t>Composition du contrat : les présentes conditions particulières et les conditions générales {{ produit.cg_libelle }}, visa {{ produit.cg_visa }}, forment le contrat.</w:t>
+      </w:r>
+    </w:p>
+    <w:p>
+      <w:r>
+        <w:t>Réclamation : toute réclamation s'adresse à {{ societe.email_reclamation }}, puis, à défaut de réponse, aux voies de recours prévues par la loi.</w:t>
+      </w:r>
+    </w:p>
+    <w:p>
+      <w:r>
+        <w:t>Fait à {{ doc.lieu_emission }}, le {{ doc.date_emission | date }}. {{ societe.raison_sociale }}, RCCM {{ societe.rccm }}.</w:t>
+      </w:r>
+    </w:p>
+    <w:p>
+      <w:r>
+        <w:t>Pour SIM Assurances : {{ signature_sim }}   Le souscripteur (signature manuscrite précédée de « lu et approuvé ») :</w:t>
+      </w:r>
+    </w:p>
+    <w:p>
+      <w:r>
+        <w:t>Vérification : {{ doc.url_verification }}   {{ qr_code }}</w:t>
       </w:r>
     </w:p>
     <w:sectPr>

</xml_diff>